<commit_message>
Metryczka: bez PESEL i daty urodzenia — druk, narracja M3, animacja, scenariusz
Co-Authored-By: Claude Fable 5.1 <noreply@anthropic.com>
Claude-Session: https://claude.ai/code/session_015kcLCwG7agccLWfRSEUYic
</commit_message>
<xml_diff>
--- a/film/druki/Metryczka.docx
+++ b/film/druki/Metryczka.docx
@@ -561,7 +561,7 @@
                 <w:sz w:val="14"/>
                 <w:szCs w:val="14"/>
               </w:rPr>
-              <w:t>PESEL</w:t>
+              <w:t>Miejsce urodzenia</w:t>
             </w:r>
           </w:p>
           <w:p>
@@ -583,7 +583,8 @@
         </w:tblPrEx>
         <w:tc>
           <w:tcPr>
-            <w:tcW w:w="4873" w:type="dxa"/>
+            <w:tcW w:w="9746" w:type="dxa"/>
+            <w:gridSpan w:val="2"/>
             <w:tcBorders>
               <w:top w:val="single" w:sz="4" w:space="0" w:color="DDD3F1"/>
               <w:left w:val="single" w:sz="4" w:space="0" w:color="DDD3F1"/>
@@ -600,83 +601,28 @@
           </w:tcPr>
           <w:p>
             <w:pPr>
-              <w:spacing w:after="20"/>
+              <w:spacing w:before="20" w:after="20"/>
             </w:pPr>
             <w:r>
               <w:rPr>
                 <w:b/>
                 <w:bCs/>
-                <w:caps/>
-                <w:color w:val="6C4CC4"/>
-                <w:sz w:val="14"/>
-                <w:szCs w:val="14"/>
-              </w:rPr>
-              <w:t>Data urodzenia</w:t>
-            </w:r>
-          </w:p>
-          <w:p>
-            <w:pPr>
-              <w:pBdr>
-                <w:bottom w:val="dotted" w:sz="6" w:space="0" w:color="A294CC"/>
-              </w:pBdr>
-              <w:spacing w:before="70" w:after="30"/>
-            </w:pPr>
-          </w:p>
-          <w:p>
-            <w:proofErr w:type="spellStart"/>
+                <w:color w:val="E8450A"/>
+                <w:sz w:val="15"/>
+                <w:szCs w:val="15"/>
+              </w:rPr>
+              <w:t xml:space="preserve">Numeru PESEL i daty urodzenia w metryczce nie wpisujemy. </w:t>
+            </w:r>
             <w:r>
               <w:rPr>
                 <w:i/>
                 <w:iCs/>
                 <w:color w:val="6F6A7D"/>
-                <w:sz w:val="13"/>
-                <w:szCs w:val="13"/>
-              </w:rPr>
-              <w:t>dd.mm.rrrr</w:t>
-            </w:r>
-            <w:proofErr w:type="spellEnd"/>
-          </w:p>
-        </w:tc>
-        <w:tc>
-          <w:tcPr>
-            <w:tcW w:w="4873" w:type="dxa"/>
-            <w:tcBorders>
-              <w:top w:val="single" w:sz="4" w:space="0" w:color="DDD3F1"/>
-              <w:left w:val="single" w:sz="4" w:space="0" w:color="DDD3F1"/>
-              <w:bottom w:val="single" w:sz="4" w:space="0" w:color="DDD3F1"/>
-              <w:right w:val="single" w:sz="4" w:space="0" w:color="DDD3F1"/>
-            </w:tcBorders>
-            <w:shd w:val="clear" w:color="auto" w:fill="EFEAF9"/>
-            <w:tcMar>
-              <w:top w:w="130" w:type="dxa"/>
-              <w:left w:w="140" w:type="dxa"/>
-              <w:bottom w:w="110" w:type="dxa"/>
-              <w:right w:w="140" w:type="dxa"/>
-            </w:tcMar>
-          </w:tcPr>
-          <w:p>
-            <w:pPr>
-              <w:spacing w:after="20"/>
-            </w:pPr>
-            <w:r>
-              <w:rPr>
-                <w:b/>
-                <w:bCs/>
-                <w:caps/>
-                <w:color w:val="6C4CC4"/>
                 <w:sz w:val="14"/>
                 <w:szCs w:val="14"/>
               </w:rPr>
-              <w:t>Miejsce urodzenia</w:t>
-            </w:r>
-          </w:p>
-          <w:p>
-            <w:pPr>
-              <w:pBdr>
-                <w:bottom w:val="dotted" w:sz="6" w:space="0" w:color="A294CC"/>
-              </w:pBdr>
-              <w:spacing w:before="70"/>
-            </w:pPr>
+              <w:t xml:space="preserve">Dane te są w księdze dzieci i nie powielamy ich w kolejnym dokumencie — zasada minimalizacji danych (art. 5 ust. 1 lit. c RODO). Dziecko identyfikuje numer w księdze dzieci.</w:t>
+            </w:r>
           </w:p>
         </w:tc>
       </w:tr>

</xml_diff>

<commit_message>
Metryczka: PESEL nie wpisujemy, data urodzenia zostaje; podstawa orzeczenia, choroby przewlekłe i leki; pytajniki w M3
Co-Authored-By: Claude Fable 5.1 <noreply@anthropic.com>
Claude-Session: https://claude.ai/code/session_015kcLCwG7agccLWfRSEUYic
</commit_message>
<xml_diff>
--- a/film/druki/Metryczka.docx
+++ b/film/druki/Metryczka.docx
@@ -550,27 +550,28 @@
           </w:tcPr>
           <w:p>
             <w:pPr>
-              <w:spacing w:after="20"/>
+              <w:spacing w:before="20" w:after="20"/>
             </w:pPr>
             <w:r>
               <w:rPr>
                 <w:b/>
                 <w:bCs/>
-                <w:caps/>
-                <w:color w:val="6C4CC4"/>
+                <w:color w:val="E8450A"/>
                 <w:sz w:val="14"/>
                 <w:szCs w:val="14"/>
               </w:rPr>
-              <w:t>Miejsce urodzenia</w:t>
-            </w:r>
-          </w:p>
-          <w:p>
-            <w:pPr>
-              <w:pBdr>
-                <w:bottom w:val="dotted" w:sz="6" w:space="0" w:color="A294CC"/>
-              </w:pBdr>
-              <w:spacing w:before="70"/>
-            </w:pPr>
+              <w:t xml:space="preserve">Numeru PESEL nie wpisujemy. </w:t>
+            </w:r>
+            <w:r>
+              <w:rPr>
+                <w:i/>
+                <w:iCs/>
+                <w:color w:val="6F6A7D"/>
+                <w:sz w:val="13"/>
+                <w:szCs w:val="13"/>
+              </w:rPr>
+              <w:t xml:space="preserve">Jest w księdze dzieci — nie powielamy go w kolejnym dokumencie (zasada minimalizacji danych, art. 5 ust. 1 lit. c RODO).</w:t>
+            </w:r>
           </w:p>
         </w:tc>
       </w:tr>
@@ -583,8 +584,7 @@
         </w:tblPrEx>
         <w:tc>
           <w:tcPr>
-            <w:tcW w:w="9746" w:type="dxa"/>
-            <w:gridSpan w:val="2"/>
+            <w:tcW w:w="4873" w:type="dxa"/>
             <w:tcBorders>
               <w:top w:val="single" w:sz="4" w:space="0" w:color="DDD3F1"/>
               <w:left w:val="single" w:sz="4" w:space="0" w:color="DDD3F1"/>
@@ -601,28 +601,83 @@
           </w:tcPr>
           <w:p>
             <w:pPr>
-              <w:spacing w:before="20" w:after="20"/>
+              <w:spacing w:after="20"/>
             </w:pPr>
             <w:r>
               <w:rPr>
                 <w:b/>
                 <w:bCs/>
-                <w:color w:val="E8450A"/>
-                <w:sz w:val="15"/>
-                <w:szCs w:val="15"/>
-              </w:rPr>
-              <w:t xml:space="preserve">Numeru PESEL i daty urodzenia w metryczce nie wpisujemy. </w:t>
-            </w:r>
+                <w:caps/>
+                <w:color w:val="6C4CC4"/>
+                <w:sz w:val="14"/>
+                <w:szCs w:val="14"/>
+              </w:rPr>
+              <w:t>Data urodzenia</w:t>
+            </w:r>
+          </w:p>
+          <w:p>
+            <w:pPr>
+              <w:pBdr>
+                <w:bottom w:val="dotted" w:sz="6" w:space="0" w:color="A294CC"/>
+              </w:pBdr>
+              <w:spacing w:before="70" w:after="30"/>
+            </w:pPr>
+          </w:p>
+          <w:p>
+            <w:proofErr w:type="spellStart"/>
             <w:r>
               <w:rPr>
                 <w:i/>
                 <w:iCs/>
                 <w:color w:val="6F6A7D"/>
+                <w:sz w:val="13"/>
+                <w:szCs w:val="13"/>
+              </w:rPr>
+              <w:t>dd.mm.rrrr</w:t>
+            </w:r>
+            <w:proofErr w:type="spellEnd"/>
+          </w:p>
+        </w:tc>
+        <w:tc>
+          <w:tcPr>
+            <w:tcW w:w="4873" w:type="dxa"/>
+            <w:tcBorders>
+              <w:top w:val="single" w:sz="4" w:space="0" w:color="DDD3F1"/>
+              <w:left w:val="single" w:sz="4" w:space="0" w:color="DDD3F1"/>
+              <w:bottom w:val="single" w:sz="4" w:space="0" w:color="DDD3F1"/>
+              <w:right w:val="single" w:sz="4" w:space="0" w:color="DDD3F1"/>
+            </w:tcBorders>
+            <w:shd w:val="clear" w:color="auto" w:fill="EFEAF9"/>
+            <w:tcMar>
+              <w:top w:w="130" w:type="dxa"/>
+              <w:left w:w="140" w:type="dxa"/>
+              <w:bottom w:w="110" w:type="dxa"/>
+              <w:right w:w="140" w:type="dxa"/>
+            </w:tcMar>
+          </w:tcPr>
+          <w:p>
+            <w:pPr>
+              <w:spacing w:after="20"/>
+            </w:pPr>
+            <w:r>
+              <w:rPr>
+                <w:b/>
+                <w:bCs/>
+                <w:caps/>
+                <w:color w:val="6C4CC4"/>
                 <w:sz w:val="14"/>
                 <w:szCs w:val="14"/>
               </w:rPr>
-              <w:t xml:space="preserve">Dane te są w księdze dzieci i nie powielamy ich w kolejnym dokumencie — zasada minimalizacji danych (art. 5 ust. 1 lit. c RODO). Dziecko identyfikuje numer w księdze dzieci.</w:t>
-            </w:r>
+              <w:t>Miejsce urodzenia</w:t>
+            </w:r>
+          </w:p>
+          <w:p>
+            <w:pPr>
+              <w:pBdr>
+                <w:bottom w:val="dotted" w:sz="6" w:space="0" w:color="A294CC"/>
+              </w:pBdr>
+              <w:spacing w:before="70"/>
+            </w:pPr>
           </w:p>
         </w:tc>
       </w:tr>
@@ -4659,7 +4714,7 @@
           <w:sz w:val="16"/>
           <w:szCs w:val="16"/>
         </w:rPr>
-        <w:t>Wpisz rozpoznanie, objawy, czynniki wyzwalające oraz zalecenia lekarza. Przy diecie podaj produkty wykluczone i sposób ich zastępowania.</w:t>
+        <w:t>Wpisz rozpoznanie (np. astma, cukrzyca, padaczka, alergia), objawy, czynniki wyzwalające, ostrzeżenia dla nauczyciela oraz zalecenia lekarza — to wpływa na codzienne funkcjonowanie dziecka w placówce. Przy diecie podaj produkty wykluczone i sposób ich zastępowania.</w:t>
       </w:r>
     </w:p>
     <w:p>
@@ -5197,6 +5252,71 @@
           <w:p>
             <w:pPr>
               <w:spacing w:line="230" w:lineRule="auto"/>
+            </w:pPr>
+          </w:p>
+        </w:tc>
+      </w:tr>
+      <w:tr>
+        <w:tblPrEx>
+          <w:tblCellMar>
+            <w:top w:w="0" w:type="dxa"/>
+            <w:bottom w:w="0" w:type="dxa"/>
+          </w:tblCellMar>
+        </w:tblPrEx>
+        <w:trPr>
+          <w:trHeight w:val="560"/>
+        </w:trPr>
+        <w:tc>
+          <w:tcPr>
+            <w:tcW w:w="9746" w:type="dxa"/>
+            <w:gridSpan w:val="3"/>
+            <w:tcBorders>
+              <w:top w:val="single" w:sz="4" w:space="0" w:color="CFC2E8"/>
+              <w:left w:val="single" w:sz="4" w:space="0" w:color="DDD3F1"/>
+              <w:bottom w:val="single" w:sz="4" w:space="0" w:color="CFC2E8"/>
+              <w:right w:val="single" w:sz="4" w:space="0" w:color="DDD3F1"/>
+            </w:tcBorders>
+            <w:shd w:val="clear" w:color="auto" w:fill="FFFFFF"/>
+            <w:tcMar>
+              <w:top w:w="80" w:type="dxa"/>
+              <w:left w:w="120" w:type="dxa"/>
+              <w:bottom w:w="80" w:type="dxa"/>
+              <w:right w:w="120" w:type="dxa"/>
+            </w:tcMar>
+            <w:vAlign w:val="center"/>
+          </w:tcPr>
+          <w:p>
+            <w:pPr>
+              <w:spacing w:after="20"/>
+            </w:pPr>
+            <w:r>
+              <w:rPr>
+                <w:b/>
+                <w:bCs/>
+                <w:caps/>
+                <w:color w:val="6C4CC4"/>
+                <w:sz w:val="14"/>
+                <w:szCs w:val="14"/>
+              </w:rPr>
+              <w:t xml:space="preserve">Podstawa wydania orzeczenia — rodzaj niepełnosprawności / schorzenie</w:t>
+            </w:r>
+            <w:r>
+              <w:rPr>
+                <w:i/>
+                <w:iCs/>
+                <w:color w:val="6F6A7D"/>
+                <w:sz w:val="13"/>
+                <w:szCs w:val="13"/>
+              </w:rPr>
+              <w:t xml:space="preserve">   (np. autyzm, niedosłuch, niepełnosprawność ruchowa, niepełnosprawność intelektualna)</w:t>
+            </w:r>
+          </w:p>
+          <w:p>
+            <w:pPr>
+              <w:pBdr>
+                <w:bottom w:val="dotted" w:sz="6" w:space="0" w:color="A294CC"/>
+              </w:pBdr>
+              <w:spacing w:before="70"/>
             </w:pPr>
           </w:p>
         </w:tc>

</xml_diff>